<commit_message>
reconcile report and README evidence
</commit_message>
<xml_diff>
--- a/docs/FarmifAI_Informe_Avances.docx
+++ b/docs/FarmifAI_Informe_Avances.docx
@@ -1,6 +1,6 @@
 
 <file path=word/document.xml><?xml version="1.0" encoding="utf-8"?>
-<w:document xmlns:w="http://schemas.openxmlformats.org/wordprocessingml/2006/main" xmlns:m="http://schemas.openxmlformats.org/officeDocument/2006/math" xmlns:r="http://schemas.openxmlformats.org/officeDocument/2006/relationships" xmlns:o="urn:schemas-microsoft-com:office:office" xmlns:v="urn:schemas-microsoft-com:vml" xmlns:w10="urn:schemas-microsoft-com:office:word" xmlns:a="http://schemas.openxmlformats.org/drawingml/2006/main" xmlns:pic="http://schemas.openxmlformats.org/drawingml/2006/picture" xmlns:wp="http://schemas.openxmlformats.org/drawingml/2006/wordprocessingDrawing">
+<w:document xmlns:a="http://schemas.openxmlformats.org/drawingml/2006/main" xmlns:pic="http://schemas.openxmlformats.org/drawingml/2006/picture" xmlns:r="http://schemas.openxmlformats.org/officeDocument/2006/relationships" xmlns:w="http://schemas.openxmlformats.org/wordprocessingml/2006/main" xmlns:wp="http://schemas.openxmlformats.org/drawingml/2006/wordprocessingDrawing">
   <w:body>
     <w:bookmarkStart w:id="59" w:name="farmifai"/>
     <w:p>
@@ -5878,7 +5878,7 @@
         <w:pStyle w:val="FirstParagraph"/>
       </w:pPr>
       <w:r>
-        <w:t xml:space="preserve">Los logs versionados no contienen una metrica final completa de accuracy para el modelo visual actual; por esta razon, este informe no declara una precision formal no verificable. La evidencia disponible si respalda que existen checkpoints, script de entrenamiento, conversion a formatos moviles y modelo MindSpore listo para integracion.</w:t>
+        <w:t xml:space="preserve">Existe evidencia versionada en docs_backup (FarmifAI_Paper_EN.tex/FarmifAI_Paper_ES.tex y FarmifAI_Documentation_EN.docx/ES.docx) con metricas del modelo visual: Top-1 92.3%, Top-3 98.1% y tiempo de inferencia 200-400ms en dispositivo Android de gama media (Snapdragon 6xx). Como mejora pendiente, se recomienda publicar en master un script de evaluacion reproducible que regenere estas metricas automaticamente.</w:t>
       </w:r>
     </w:p>
     <w:bookmarkEnd w:id="51"/>
@@ -5897,7 +5897,7 @@
         <w:pStyle w:val="FirstParagraph"/>
       </w:pPr>
       <w:r>
-        <w:t xml:space="preserve">El informe original del proyecto indica uso de creditos e infraestructura Huawei Cloud para entrenamiento. En el repositorio actual se verifican scripts y artefactos de entrenamiento, pero no se encontraron capturas versionadas del panel de Huawei Cloud, configuracion ECS o monitoreo de GPU. Por consistencia documental, este informe reporta el avance tecnico verificable en el repositorio y deja la infraestructura cloud como evidencia externa no versionada.</w:t>
+        <w:t xml:space="preserve">En docs_backup existe evidencia versionada de infraestructura y flujo de despliegue cloud: fig_deployment_workflow.pdf y referencias a ModelArts/OBS en PRESENTATION_30S_SCRIPTS_EN_ES.txt. No se encontraron capturas de consola (panel Huawei Cloud, ECS o monitoreo GPU), por lo que la evidencia cloud queda documentada como parcial.</w:t>
       </w:r>
     </w:p>
     <w:p>
@@ -6104,7 +6104,7 @@
         <w:pStyle w:val="FirstParagraph"/>
       </w:pPr>
       <w:r>
-        <w:t xml:space="preserve">El informe base registraba una salida de campo y hallazgos como interes de adopcion, prioridad de voz y compatibilidad con dispositivos Android de 4 a 8 GB de RAM. En este repositorio no se encontraron fotografias, formularios, tablas de encuesta ni graficas de validacion de campo versionadas.</w:t>
+        <w:t xml:space="preserve">En docs_backup existe evidencia versionada de validacion de campo: Encuestas_agricultores.pdf (40 paginas escaneadas) y capturas de uso de la app en capturasapp (interfaz_conversacional.jpeg, diagnosticovisual.png, diagnosticovis.jpeg, recomendaciones.jpeg).</w:t>
       </w:r>
     </w:p>
     <w:p>
@@ -6112,7 +6112,7 @@
         <w:pStyle w:val="BodyText"/>
       </w:pPr>
       <w:r>
-        <w:t xml:space="preserve">Para mantener trazabilidad profesional, este informe conserva la conclusion funcional derivada de esa linea de trabajo, pero no incorpora porcentajes de adopcion ni resultados de encuesta como evidencia verificable dentro del repositorio. El requerimiento de voz, operacion local y dispositivos de gama media si queda respaldado por decisiones tecnicas implementadas: Vosk offline, TTS local, GGUF cuantizado y controles de modo local.</w:t>
+        <w:t xml:space="preserve">La evidencia de campo ya esta versionada en formato escaneado. Como siguiente paso, se recomienda consolidar una hoja resumen anonimizada con estadisticas agregadas para facilitar trazabilidad cuantitativa.</w:t>
       </w:r>
     </w:p>
     <w:bookmarkEnd w:id="54"/>
@@ -6130,49 +6130,49 @@
         <w:pStyle w:val="FirstParagraph"/>
       </w:pPr>
       <w:r>
-        <w:t xml:space="preserve">Este documento queda como informe tecnico unico de avances. Los diagramas usados como evidencia se incrustan en el</w:t>
-      </w:r>
-      <w:r>
-        <w:t xml:space="preserve"> </w:t>
+        <w:t xml:space="preserve">Este documento se mantiene como informe tecnico consolidado, y la carpeta docs/images se conserva como soporte visual sincronizado con el README para facilitar revision rapida del estado del proyecto.</w:t>
+      </w:r>
+      <w:r>
+        <w:t xml:space="preserve"/>
       </w:r>
       <w:r>
         <w:rPr>
           <w:rStyle w:val="VerbatimChar"/>
         </w:rPr>
-        <w:t xml:space="preserve">docx</w:t>
-      </w:r>
-      <w:r>
-        <w:t xml:space="preserve">, de modo que la carpeta</w:t>
-      </w:r>
-      <w:r>
-        <w:t xml:space="preserve"> </w:t>
+        <w:t xml:space="preserve"/>
+      </w:r>
+      <w:r>
+        <w:t xml:space="preserve"/>
+      </w:r>
+      <w:r>
+        <w:t xml:space="preserve"/>
       </w:r>
       <w:r>
         <w:rPr>
           <w:rStyle w:val="VerbatimChar"/>
         </w:rPr>
-        <w:t xml:space="preserve">docs</w:t>
-      </w:r>
-      <w:r>
-        <w:t xml:space="preserve"> </w:t>
-      </w:r>
-      <w:r>
-        <w:t xml:space="preserve">no requiere conservar documentacion tecnica paralela ni imagenes sueltas para explicar el estado del proyecto. El</w:t>
-      </w:r>
-      <w:r>
-        <w:t xml:space="preserve"> </w:t>
+        <w:t xml:space="preserve"/>
+      </w:r>
+      <w:r>
+        <w:t xml:space="preserve"/>
+      </w:r>
+      <w:r>
+        <w:t xml:space="preserve"/>
+      </w:r>
+      <w:r>
+        <w:t xml:space="preserve"/>
       </w:r>
       <w:r>
         <w:rPr>
           <w:rStyle w:val="VerbatimChar"/>
         </w:rPr>
-        <w:t xml:space="preserve">README.md</w:t>
-      </w:r>
-      <w:r>
-        <w:t xml:space="preserve"> </w:t>
-      </w:r>
-      <w:r>
-        <w:t xml:space="preserve">del repositorio se actualiza para apuntar a este informe como fuente documental principal.</w:t>
+        <w:t xml:space="preserve"/>
+      </w:r>
+      <w:r>
+        <w:t xml:space="preserve"/>
+      </w:r>
+      <w:r>
+        <w:t xml:space="preserve"/>
       </w:r>
     </w:p>
     <w:bookmarkEnd w:id="55"/>
@@ -6751,19 +6751,19 @@
               <w:jc w:val="left"/>
             </w:pPr>
             <w:r>
-              <w:t xml:space="preserve">En evaluacion</w:t>
-            </w:r>
-          </w:p>
-        </w:tc>
-        <w:tc>
-          <w:tcPr/>
-          <w:p>
-            <w:pPr>
-              <w:pStyle w:val="Compact"/>
-              <w:jc w:val="left"/>
-            </w:pPr>
-            <w:r>
-              <w:t xml:space="preserve">Medir tokens/s por dispositivo y ajustar cuantizacion</w:t>
+              <w:t xml:space="preserve">Parcialmente documentada</w:t>
+            </w:r>
+          </w:p>
+        </w:tc>
+        <w:tc>
+          <w:tcPr/>
+          <w:p>
+            <w:pPr>
+              <w:pStyle w:val="Compact"/>
+              <w:jc w:val="left"/>
+            </w:pPr>
+            <w:r>
+              <w:t xml:space="preserve">Publicar matriz por perfil de RAM (4GB/6GB/8GB) con tokens/s y latencia end-to-end</w:t>
             </w:r>
           </w:p>
         </w:tc>
@@ -6789,19 +6789,19 @@
               <w:jc w:val="left"/>
             </w:pPr>
             <w:r>
-              <w:t xml:space="preserve">No versionada</w:t>
-            </w:r>
-          </w:p>
-        </w:tc>
-        <w:tc>
-          <w:tcPr/>
-          <w:p>
-            <w:pPr>
-              <w:pStyle w:val="Compact"/>
-              <w:jc w:val="left"/>
-            </w:pPr>
-            <w:r>
-              <w:t xml:space="preserve">Agregar reporte de evaluacion reproducible al pipeline</w:t>
+              <w:t xml:space="preserve">Documentada en docs_backup</w:t>
+            </w:r>
+          </w:p>
+        </w:tc>
+        <w:tc>
+          <w:tcPr/>
+          <w:p>
+            <w:pPr>
+              <w:pStyle w:val="Compact"/>
+              <w:jc w:val="left"/>
+            </w:pPr>
+            <w:r>
+              <w:t xml:space="preserve">Mover script de evaluacion y reporte de accuracy a la rama principal</w:t>
             </w:r>
           </w:p>
         </w:tc>
@@ -6827,19 +6827,19 @@
               <w:jc w:val="left"/>
             </w:pPr>
             <w:r>
-              <w:t xml:space="preserve">No versionada</w:t>
-            </w:r>
-          </w:p>
-        </w:tc>
-        <w:tc>
-          <w:tcPr/>
-          <w:p>
-            <w:pPr>
-              <w:pStyle w:val="Compact"/>
-              <w:jc w:val="left"/>
-            </w:pPr>
-            <w:r>
-              <w:t xml:space="preserve">Incorporar anexos firmados o anonimizados si se requiere</w:t>
+              <w:t xml:space="preserve">Documentada en docs_backup</w:t>
+            </w:r>
+          </w:p>
+        </w:tc>
+        <w:tc>
+          <w:tcPr/>
+          <w:p>
+            <w:pPr>
+              <w:pStyle w:val="Compact"/>
+              <w:jc w:val="left"/>
+            </w:pPr>
+            <w:r>
+              <w:t xml:space="preserve">Publicar anexo resumido y anonimizado con metricas de encuestas</w:t>
             </w:r>
           </w:p>
         </w:tc>
@@ -6865,7 +6865,7 @@
               <w:jc w:val="left"/>
             </w:pPr>
             <w:r>
-              <w:t xml:space="preserve">Parcial</w:t>
+              <w:t xml:space="preserve">Parcial (sin bundle GGUF oficial)</w:t>
             </w:r>
           </w:p>
         </w:tc>

</xml_diff>